<commit_message>
Deprecated alias uclar silindi Asama C tamamlandi
</commit_message>
<xml_diff>
--- a/backend-docs/DEPRECATED_ENDPOINTS_TAKVIM.docx
+++ b/backend-docs/DEPRECATED_ENDPOINTS_TAKVIM.docx
@@ -16,7 +16,17 @@
         <w:pStyle w:val="BlockText"/>
       </w:pPr>
       <w:r>
-        <w:t xml:space="preserve">Son güncelleme: 8 Ağustos 2026</w:t>
+        <w:t xml:space="preserve">Son güncelleme: 8 Ağustos 2026 —</w:t>
+      </w:r>
+      <w:r>
+        <w:t xml:space="preserve"> </w:t>
+      </w:r>
+      <w:r>
+        <w:rPr>
+          <w:bCs/>
+          <w:b/>
+        </w:rPr>
+        <w:t xml:space="preserve">Aşama C tamamlandı</w:t>
       </w:r>
     </w:p>
     <w:bookmarkStart w:id="20" w:name="genel-bakış"/>
@@ -1025,13 +1035,470 @@
       </w:r>
     </w:p>
     <w:bookmarkEnd w:id="23"/>
-    <w:bookmarkStart w:id="24" w:name="aşama-c-kaldırma"/>
+    <w:bookmarkStart w:id="24" w:name="aşama-c-kaldırma-tamamlandi"/>
     <w:p>
       <w:pPr>
         <w:pStyle w:val="Heading3"/>
       </w:pPr>
       <w:r>
-        <w:t xml:space="preserve">Aşama C — Kaldırma</w:t>
+        <w:t xml:space="preserve">Aşama C — Kaldırma ✅ TAMAMLANDI</w:t>
+      </w:r>
+    </w:p>
+    <w:p>
+      <w:pPr>
+        <w:pStyle w:val="FirstParagraph"/>
+      </w:pPr>
+      <w:r>
+        <w:t xml:space="preserve">Aşağıdaki alias route dosyaları</w:t>
+      </w:r>
+      <w:r>
+        <w:t xml:space="preserve"> </w:t>
+      </w:r>
+      <w:r>
+        <w:rPr>
+          <w:bCs/>
+          <w:b/>
+        </w:rPr>
+        <w:t xml:space="preserve">silindi</w:t>
+      </w:r>
+      <w:r>
+        <w:t xml:space="preserve"> </w:t>
+      </w:r>
+      <w:r>
+        <w:t xml:space="preserve">(8 Ağustos 2026):</w:t>
+      </w:r>
+      <w:r>
+        <w:t xml:space="preserve"> </w:t>
+      </w:r>
+      <w:r>
+        <w:t xml:space="preserve">-</w:t>
+      </w:r>
+      <w:r>
+        <w:t xml:space="preserve"> </w:t>
+      </w:r>
+      <w:r>
+        <w:rPr>
+          <w:rStyle w:val="VerbatimChar"/>
+          <w:strike/>
+        </w:rPr>
+        <w:t xml:space="preserve">app/api/leaderboard/route.ts</w:t>
+      </w:r>
+      <w:r>
+        <w:t xml:space="preserve"> </w:t>
+      </w:r>
+      <w:r>
+        <w:t xml:space="preserve">-</w:t>
+      </w:r>
+      <w:r>
+        <w:t xml:space="preserve"> </w:t>
+      </w:r>
+      <w:r>
+        <w:rPr>
+          <w:rStyle w:val="VerbatimChar"/>
+          <w:strike/>
+        </w:rPr>
+        <w:t xml:space="preserve">app/api/membership/packages/route.ts</w:t>
+      </w:r>
+      <w:r>
+        <w:t xml:space="preserve"> </w:t>
+      </w:r>
+      <w:r>
+        <w:t xml:space="preserve">-</w:t>
+      </w:r>
+      <w:r>
+        <w:t xml:space="preserve"> </w:t>
+      </w:r>
+      <w:r>
+        <w:rPr>
+          <w:rStyle w:val="VerbatimChar"/>
+          <w:strike/>
+        </w:rPr>
+        <w:t xml:space="preserve">app/api/payment/config/route.ts</w:t>
+      </w:r>
+      <w:r>
+        <w:t xml:space="preserve"> </w:t>
+      </w:r>
+      <w:r>
+        <w:t xml:space="preserve">-</w:t>
+      </w:r>
+      <w:r>
+        <w:t xml:space="preserve"> </w:t>
+      </w:r>
+      <w:r>
+        <w:rPr>
+          <w:rStyle w:val="VerbatimChar"/>
+          <w:strike/>
+        </w:rPr>
+        <w:t xml:space="preserve">app/api/payment/requests/route.ts</w:t>
+      </w:r>
+      <w:r>
+        <w:t xml:space="preserve"> </w:t>
+      </w:r>
+      <w:r>
+        <w:t xml:space="preserve">-</w:t>
+      </w:r>
+      <w:r>
+        <w:t xml:space="preserve"> </w:t>
+      </w:r>
+      <w:r>
+        <w:rPr>
+          <w:rStyle w:val="VerbatimChar"/>
+          <w:strike/>
+        </w:rPr>
+        <w:t xml:space="preserve">app/api/payment-methods/route.ts</w:t>
+      </w:r>
+      <w:r>
+        <w:t xml:space="preserve"> </w:t>
+      </w:r>
+      <w:r>
+        <w:t xml:space="preserve">-</w:t>
+      </w:r>
+      <w:r>
+        <w:t xml:space="preserve"> </w:t>
+      </w:r>
+      <w:r>
+        <w:rPr>
+          <w:rStyle w:val="VerbatimChar"/>
+          <w:strike/>
+        </w:rPr>
+        <w:t xml:space="preserve">app/api/payment-settings/route.ts</w:t>
+      </w:r>
+      <w:r>
+        <w:t xml:space="preserve"> </w:t>
+      </w:r>
+      <w:r>
+        <w:t xml:space="preserve">-</w:t>
+      </w:r>
+      <w:r>
+        <w:t xml:space="preserve"> </w:t>
+      </w:r>
+      <w:r>
+        <w:rPr>
+          <w:rStyle w:val="VerbatimChar"/>
+          <w:strike/>
+        </w:rPr>
+        <w:t xml:space="preserve">app/api/rooms/[roomId]/music/current/route.ts</w:t>
+      </w:r>
+      <w:r>
+        <w:t xml:space="preserve"> </w:t>
+      </w:r>
+      <w:r>
+        <w:t xml:space="preserve">-</w:t>
+      </w:r>
+      <w:r>
+        <w:t xml:space="preserve"> </w:t>
+      </w:r>
+      <w:r>
+        <w:rPr>
+          <w:rStyle w:val="VerbatimChar"/>
+          <w:strike/>
+        </w:rPr>
+        <w:t xml:space="preserve">app/api/rooms/[roomId]/music/skip/route.ts</w:t>
+      </w:r>
+      <w:r>
+        <w:t xml:space="preserve"> </w:t>
+      </w:r>
+      <w:r>
+        <w:t xml:space="preserve">-</w:t>
+      </w:r>
+      <w:r>
+        <w:t xml:space="preserve"> </w:t>
+      </w:r>
+      <w:r>
+        <w:rPr>
+          <w:rStyle w:val="VerbatimChar"/>
+          <w:strike/>
+        </w:rPr>
+        <w:t xml:space="preserve">app/api/rooms/[roomId]/music/stop/route.ts</w:t>
+      </w:r>
+      <w:r>
+        <w:t xml:space="preserve"> </w:t>
+      </w:r>
+      <w:r>
+        <w:t xml:space="preserve">- Boş kalan dizinler de kaldırıldı.</w:t>
+      </w:r>
+      <w:r>
+        <w:t xml:space="preserve"> </w:t>
+      </w:r>
+      <w:r>
+        <w:t xml:space="preserve">-</w:t>
+      </w:r>
+      <w:r>
+        <w:t xml:space="preserve"> </w:t>
+      </w:r>
+      <w:r>
+        <w:rPr>
+          <w:rStyle w:val="VerbatimChar"/>
+          <w:bCs/>
+          <w:b/>
+        </w:rPr>
+        <w:t xml:space="preserve">/api/tencent/webhook</w:t>
+      </w:r>
+      <w:r>
+        <w:rPr>
+          <w:bCs/>
+          <w:b/>
+        </w:rPr>
+        <w:t xml:space="preserve"> </w:t>
+      </w:r>
+      <w:r>
+        <w:rPr>
+          <w:bCs/>
+          <w:b/>
+        </w:rPr>
+        <w:t xml:space="preserve">korundu</w:t>
+      </w:r>
+      <w:r>
+        <w:t xml:space="preserve"> </w:t>
+      </w:r>
+      <w:r>
+        <w:t xml:space="preserve">— sağlayıcıda kayıtlı.</w:t>
+      </w:r>
+      <w:r>
+        <w:t xml:space="preserve"> </w:t>
+      </w:r>
+      <w:r>
+        <w:t xml:space="preserve">- Belgeler güncellendi: 690 uç, 148 alan, 438 yol (API_REGISTRY, ENDPOINTS, OpenAPI, Postman).</w:t>
+      </w:r>
+    </w:p>
+    <w:p>
+      <w:r>
+        <w:pict>
+          <v:rect style="width:0;height:1.5pt" o:hralign="center" o:hrstd="t" o:hr="t"/>
+        </w:pict>
+      </w:r>
+    </w:p>
+    <w:bookmarkEnd w:id="24"/>
+    <w:bookmarkEnd w:id="25"/>
+    <w:bookmarkStart w:id="26" w:name="flutter-geçiş-rehberi-hızlı-başvuru"/>
+    <w:p>
+      <w:pPr>
+        <w:pStyle w:val="Heading2"/>
+      </w:pPr>
+      <w:r>
+        <w:t xml:space="preserve">4. Flutter Geçiş Rehberi (Hızlı Başvuru)</w:t>
+      </w:r>
+    </w:p>
+    <w:p>
+      <w:pPr>
+        <w:pStyle w:val="FirstParagraph"/>
+      </w:pPr>
+      <w:r>
+        <w:t xml:space="preserve">Mobil tarafta yapılması gereken değişiklikler:</w:t>
+      </w:r>
+    </w:p>
+    <w:p>
+      <w:pPr>
+        <w:pStyle w:val="SourceCode"/>
+      </w:pPr>
+      <w:r>
+        <w:rPr>
+          <w:rStyle w:val="VerbatimChar"/>
+        </w:rPr>
+        <w:t xml:space="preserve">// ESKİ → YENİ</w:t>
+      </w:r>
+      <w:r>
+        <w:br/>
+      </w:r>
+      <w:r>
+        <w:rPr>
+          <w:rStyle w:val="VerbatimChar"/>
+        </w:rPr>
+        <w:t xml:space="preserve">'/api/leaderboard'              → '/api/leaderboards'</w:t>
+      </w:r>
+      <w:r>
+        <w:br/>
+      </w:r>
+      <w:r>
+        <w:rPr>
+          <w:rStyle w:val="VerbatimChar"/>
+        </w:rPr>
+        <w:t xml:space="preserve">'/api/membership/packages'      → '/api/memberships/packages'</w:t>
+      </w:r>
+      <w:r>
+        <w:br/>
+      </w:r>
+      <w:r>
+        <w:rPr>
+          <w:rStyle w:val="VerbatimChar"/>
+        </w:rPr>
+        <w:t xml:space="preserve">'/api/payment/config'           → '/api/payments/config'</w:t>
+      </w:r>
+      <w:r>
+        <w:br/>
+      </w:r>
+      <w:r>
+        <w:rPr>
+          <w:rStyle w:val="VerbatimChar"/>
+        </w:rPr>
+        <w:t xml:space="preserve">'/api/payment/requests'         → '/api/payments/requests'</w:t>
+      </w:r>
+      <w:r>
+        <w:br/>
+      </w:r>
+      <w:r>
+        <w:rPr>
+          <w:rStyle w:val="VerbatimChar"/>
+        </w:rPr>
+        <w:t xml:space="preserve">'/api/payment-methods'          → '/api/payments/methods'</w:t>
+      </w:r>
+      <w:r>
+        <w:br/>
+      </w:r>
+      <w:r>
+        <w:rPr>
+          <w:rStyle w:val="VerbatimChar"/>
+        </w:rPr>
+        <w:t xml:space="preserve">'/api/payment-settings'         → '/api/payments/settings'</w:t>
+      </w:r>
+      <w:r>
+        <w:br/>
+      </w:r>
+      <w:r>
+        <w:rPr>
+          <w:rStyle w:val="VerbatimChar"/>
+        </w:rPr>
+        <w:t xml:space="preserve">'/api/rooms/$roomId/music/current' → '/api/chat/rooms/$roomId/music'       // GET</w:t>
+      </w:r>
+      <w:r>
+        <w:br/>
+      </w:r>
+      <w:r>
+        <w:rPr>
+          <w:rStyle w:val="VerbatimChar"/>
+        </w:rPr>
+        <w:t xml:space="preserve">'/api/rooms/$roomId/music/skip'    → '/api/chat/rooms/$roomId/music'       // DELETE (yöntem değişti!)</w:t>
+      </w:r>
+      <w:r>
+        <w:br/>
+      </w:r>
+      <w:r>
+        <w:rPr>
+          <w:rStyle w:val="VerbatimChar"/>
+        </w:rPr>
+        <w:t xml:space="preserve">'/api/rooms/$roomId/music/stop'    → '/api/chat/rooms/$roomId/music/stop'  // POST</w:t>
+      </w:r>
+    </w:p>
+    <w:p>
+      <w:pPr>
+        <w:pStyle w:val="FirstParagraph"/>
+      </w:pPr>
+      <w:r>
+        <w:rPr>
+          <w:bCs/>
+          <w:b/>
+        </w:rPr>
+        <w:t xml:space="preserve">Dikkat:</w:t>
+      </w:r>
+      <w:r>
+        <w:t xml:space="preserve"> </w:t>
+      </w:r>
+      <w:r>
+        <w:rPr>
+          <w:rStyle w:val="VerbatimChar"/>
+        </w:rPr>
+        <w:t xml:space="preserve">music/skip</w:t>
+      </w:r>
+      <w:r>
+        <w:t xml:space="preserve"> </w:t>
+      </w:r>
+      <w:r>
+        <w:t xml:space="preserve">artık</w:t>
+      </w:r>
+      <w:r>
+        <w:t xml:space="preserve"> </w:t>
+      </w:r>
+      <w:r>
+        <w:rPr>
+          <w:rStyle w:val="VerbatimChar"/>
+        </w:rPr>
+        <w:t xml:space="preserve">DELETE</w:t>
+      </w:r>
+      <w:r>
+        <w:t xml:space="preserve"> </w:t>
+      </w:r>
+      <w:r>
+        <w:t xml:space="preserve">yöntemiyle çağrılıyor. Flutter</w:t>
+      </w:r>
+      <w:r>
+        <w:t xml:space="preserve"> </w:t>
+      </w:r>
+      <w:r>
+        <w:rPr>
+          <w:rStyle w:val="VerbatimChar"/>
+        </w:rPr>
+        <w:t xml:space="preserve">http.delete(...)</w:t>
+      </w:r>
+      <w:r>
+        <w:t xml:space="preserve"> </w:t>
+      </w:r>
+      <w:r>
+        <w:t xml:space="preserve">kullanmalı.</w:t>
+      </w:r>
+    </w:p>
+    <w:p>
+      <w:r>
+        <w:pict>
+          <v:rect style="width:0;height:1.5pt" o:hralign="center" o:hrstd="t" o:hr="t"/>
+        </w:pict>
+      </w:r>
+    </w:p>
+    <w:bookmarkEnd w:id="26"/>
+    <w:bookmarkStart w:id="27" w:name="önemli-not-room-vs-rooms"/>
+    <w:p>
+      <w:pPr>
+        <w:pStyle w:val="Heading2"/>
+      </w:pPr>
+      <w:r>
+        <w:t xml:space="preserve">5. Önemli Not — room vs rooms</w:t>
+      </w:r>
+    </w:p>
+    <w:p>
+      <w:pPr>
+        <w:pStyle w:val="FirstParagraph"/>
+      </w:pPr>
+      <w:r>
+        <w:rPr>
+          <w:rStyle w:val="VerbatimChar"/>
+        </w:rPr>
+        <w:t xml:space="preserve">/api/room/{sessionId}/...</w:t>
+      </w:r>
+      <w:r>
+        <w:t xml:space="preserve"> </w:t>
+      </w:r>
+      <w:r>
+        <w:t xml:space="preserve">(canlı fal seansı) ile</w:t>
+      </w:r>
+      <w:r>
+        <w:t xml:space="preserve"> </w:t>
+      </w:r>
+      <w:r>
+        <w:rPr>
+          <w:rStyle w:val="VerbatimChar"/>
+        </w:rPr>
+        <w:t xml:space="preserve">/api/rooms/{roomId}/...</w:t>
+      </w:r>
+      <w:r>
+        <w:t xml:space="preserve"> </w:t>
+      </w:r>
+      <w:r>
+        <w:t xml:space="preserve">(sohbet odası)</w:t>
+      </w:r>
+      <w:r>
+        <w:t xml:space="preserve"> </w:t>
+      </w:r>
+      <w:r>
+        <w:rPr>
+          <w:bCs/>
+          <w:b/>
+        </w:rPr>
+        <w:t xml:space="preserve">farklı kimlik uzaylarıdır</w:t>
+      </w:r>
+      <w:r>
+        <w:t xml:space="preserve"> </w:t>
+      </w:r>
+      <w:r>
+        <w:t xml:space="preserve">ve birleştirilmemiştir. Bunlar kasıtlı olarak ayrı tutulmaktadır:</w:t>
       </w:r>
     </w:p>
     <w:p>
@@ -1043,142 +1510,25 @@
         <w:pStyle w:val="Compact"/>
       </w:pPr>
       <w:r>
-        <w:t xml:space="preserve">Eski alias route dosyalarını silin:</w:t>
-      </w:r>
-    </w:p>
-    <w:p>
-      <w:pPr>
-        <w:numPr>
-          <w:ilvl w:val="1"/>
-          <w:numId w:val="1004"/>
-        </w:numPr>
-        <w:pStyle w:val="Compact"/>
-      </w:pPr>
-      <w:r>
-        <w:rPr>
-          <w:rStyle w:val="VerbatimChar"/>
-        </w:rPr>
-        <w:t xml:space="preserve">app/api/leaderboard/route.ts</w:t>
-      </w:r>
-    </w:p>
-    <w:p>
-      <w:pPr>
-        <w:numPr>
-          <w:ilvl w:val="1"/>
-          <w:numId w:val="1004"/>
-        </w:numPr>
-        <w:pStyle w:val="Compact"/>
-      </w:pPr>
-      <w:r>
-        <w:rPr>
-          <w:rStyle w:val="VerbatimChar"/>
-        </w:rPr>
-        <w:t xml:space="preserve">app/api/membership/packages/route.ts</w:t>
-      </w:r>
-    </w:p>
-    <w:p>
-      <w:pPr>
-        <w:numPr>
-          <w:ilvl w:val="1"/>
-          <w:numId w:val="1004"/>
-        </w:numPr>
-        <w:pStyle w:val="Compact"/>
-      </w:pPr>
-      <w:r>
-        <w:rPr>
-          <w:rStyle w:val="VerbatimChar"/>
-        </w:rPr>
-        <w:t xml:space="preserve">app/api/payment/config/route.ts</w:t>
-      </w:r>
-    </w:p>
-    <w:p>
-      <w:pPr>
-        <w:numPr>
-          <w:ilvl w:val="1"/>
-          <w:numId w:val="1004"/>
-        </w:numPr>
-        <w:pStyle w:val="Compact"/>
-      </w:pPr>
-      <w:r>
-        <w:rPr>
-          <w:rStyle w:val="VerbatimChar"/>
-        </w:rPr>
-        <w:t xml:space="preserve">app/api/payment/requests/route.ts</w:t>
-      </w:r>
-    </w:p>
-    <w:p>
-      <w:pPr>
-        <w:numPr>
-          <w:ilvl w:val="1"/>
-          <w:numId w:val="1004"/>
-        </w:numPr>
-        <w:pStyle w:val="Compact"/>
-      </w:pPr>
-      <w:r>
-        <w:rPr>
-          <w:rStyle w:val="VerbatimChar"/>
-        </w:rPr>
-        <w:t xml:space="preserve">app/api/payment-methods/route.ts</w:t>
-      </w:r>
-    </w:p>
-    <w:p>
-      <w:pPr>
-        <w:numPr>
-          <w:ilvl w:val="1"/>
-          <w:numId w:val="1004"/>
-        </w:numPr>
-        <w:pStyle w:val="Compact"/>
-      </w:pPr>
-      <w:r>
-        <w:rPr>
-          <w:rStyle w:val="VerbatimChar"/>
-        </w:rPr>
-        <w:t xml:space="preserve">app/api/payment-settings/route.ts</w:t>
-      </w:r>
-    </w:p>
-    <w:p>
-      <w:pPr>
-        <w:numPr>
-          <w:ilvl w:val="1"/>
-          <w:numId w:val="1004"/>
-        </w:numPr>
-        <w:pStyle w:val="Compact"/>
-      </w:pPr>
-      <w:r>
-        <w:rPr>
-          <w:rStyle w:val="VerbatimChar"/>
-        </w:rPr>
-        <w:t xml:space="preserve">app/api/rooms/[roomId]/music/current/route.ts</w:t>
-      </w:r>
-    </w:p>
-    <w:p>
-      <w:pPr>
-        <w:numPr>
-          <w:ilvl w:val="1"/>
-          <w:numId w:val="1004"/>
-        </w:numPr>
-        <w:pStyle w:val="Compact"/>
-      </w:pPr>
-      <w:r>
-        <w:rPr>
-          <w:rStyle w:val="VerbatimChar"/>
-        </w:rPr>
-        <w:t xml:space="preserve">app/api/rooms/[roomId]/music/skip/route.ts</w:t>
-      </w:r>
-    </w:p>
-    <w:p>
-      <w:pPr>
-        <w:numPr>
-          <w:ilvl w:val="1"/>
-          <w:numId w:val="1004"/>
-        </w:numPr>
-        <w:pStyle w:val="Compact"/>
-      </w:pPr>
-      <w:r>
-        <w:rPr>
-          <w:rStyle w:val="VerbatimChar"/>
-        </w:rPr>
-        <w:t xml:space="preserve">app/api/rooms/[roomId]/music/stop/route.ts</w:t>
+        <w:rPr>
+          <w:rStyle w:val="VerbatimChar"/>
+        </w:rPr>
+        <w:t xml:space="preserve">room</w:t>
+      </w:r>
+      <w:r>
+        <w:t xml:space="preserve"> </w:t>
+      </w:r>
+      <w:r>
+        <w:t xml:space="preserve">→ Canlı fal seansı kimliği (</w:t>
+      </w:r>
+      <w:r>
+        <w:rPr>
+          <w:rStyle w:val="VerbatimChar"/>
+        </w:rPr>
+        <w:t xml:space="preserve">LiveSession.id</w:t>
+      </w:r>
+      <w:r>
+        <w:t xml:space="preserve">)</w:t>
       </w:r>
     </w:p>
     <w:p>
@@ -1186,325 +1536,6 @@
         <w:numPr>
           <w:ilvl w:val="0"/>
           <w:numId w:val="1003"/>
-        </w:numPr>
-        <w:pStyle w:val="Compact"/>
-      </w:pPr>
-      <w:r>
-        <w:rPr>
-          <w:rStyle w:val="VerbatimChar"/>
-          <w:bCs/>
-          <w:b/>
-        </w:rPr>
-        <w:t xml:space="preserve">/api/tencent/webhook</w:t>
-      </w:r>
-      <w:r>
-        <w:rPr>
-          <w:bCs/>
-          <w:b/>
-        </w:rPr>
-        <w:t xml:space="preserve"> </w:t>
-      </w:r>
-      <w:r>
-        <w:rPr>
-          <w:bCs/>
-          <w:b/>
-        </w:rPr>
-        <w:t xml:space="preserve">SİLİNMEZ</w:t>
-      </w:r>
-      <w:r>
-        <w:t xml:space="preserve"> </w:t>
-      </w:r>
-      <w:r>
-        <w:t xml:space="preserve">— sağlayıcı tarafında kayıtlıdır, korunmalıdır.</w:t>
-      </w:r>
-    </w:p>
-    <w:p>
-      <w:pPr>
-        <w:numPr>
-          <w:ilvl w:val="0"/>
-          <w:numId w:val="1003"/>
-        </w:numPr>
-        <w:pStyle w:val="Compact"/>
-      </w:pPr>
-      <w:r>
-        <w:t xml:space="preserve">Belgeleri güncelleyin (API_REGISTRY, ENDPOINTS, OpenAPI).</w:t>
-      </w:r>
-    </w:p>
-    <w:p>
-      <w:r>
-        <w:pict>
-          <v:rect style="width:0;height:1.5pt" o:hralign="center" o:hrstd="t" o:hr="t"/>
-        </w:pict>
-      </w:r>
-    </w:p>
-    <w:bookmarkEnd w:id="24"/>
-    <w:bookmarkEnd w:id="25"/>
-    <w:bookmarkStart w:id="26" w:name="flutter-geçiş-rehberi-hızlı-başvuru"/>
-    <w:p>
-      <w:pPr>
-        <w:pStyle w:val="Heading2"/>
-      </w:pPr>
-      <w:r>
-        <w:t xml:space="preserve">4. Flutter Geçiş Rehberi (Hızlı Başvuru)</w:t>
-      </w:r>
-    </w:p>
-    <w:p>
-      <w:pPr>
-        <w:pStyle w:val="FirstParagraph"/>
-      </w:pPr>
-      <w:r>
-        <w:t xml:space="preserve">Mobil tarafta yapılması gereken değişiklikler:</w:t>
-      </w:r>
-    </w:p>
-    <w:p>
-      <w:pPr>
-        <w:pStyle w:val="SourceCode"/>
-      </w:pPr>
-      <w:r>
-        <w:rPr>
-          <w:rStyle w:val="VerbatimChar"/>
-        </w:rPr>
-        <w:t xml:space="preserve">// ESKİ → YENİ</w:t>
-      </w:r>
-      <w:r>
-        <w:br/>
-      </w:r>
-      <w:r>
-        <w:rPr>
-          <w:rStyle w:val="VerbatimChar"/>
-        </w:rPr>
-        <w:t xml:space="preserve">'/api/leaderboard'              → '/api/leaderboards'</w:t>
-      </w:r>
-      <w:r>
-        <w:br/>
-      </w:r>
-      <w:r>
-        <w:rPr>
-          <w:rStyle w:val="VerbatimChar"/>
-        </w:rPr>
-        <w:t xml:space="preserve">'/api/membership/packages'      → '/api/memberships/packages'</w:t>
-      </w:r>
-      <w:r>
-        <w:br/>
-      </w:r>
-      <w:r>
-        <w:rPr>
-          <w:rStyle w:val="VerbatimChar"/>
-        </w:rPr>
-        <w:t xml:space="preserve">'/api/payment/config'           → '/api/payments/config'</w:t>
-      </w:r>
-      <w:r>
-        <w:br/>
-      </w:r>
-      <w:r>
-        <w:rPr>
-          <w:rStyle w:val="VerbatimChar"/>
-        </w:rPr>
-        <w:t xml:space="preserve">'/api/payment/requests'         → '/api/payments/requests'</w:t>
-      </w:r>
-      <w:r>
-        <w:br/>
-      </w:r>
-      <w:r>
-        <w:rPr>
-          <w:rStyle w:val="VerbatimChar"/>
-        </w:rPr>
-        <w:t xml:space="preserve">'/api/payment-methods'          → '/api/payments/methods'</w:t>
-      </w:r>
-      <w:r>
-        <w:br/>
-      </w:r>
-      <w:r>
-        <w:rPr>
-          <w:rStyle w:val="VerbatimChar"/>
-        </w:rPr>
-        <w:t xml:space="preserve">'/api/payment-settings'         → '/api/payments/settings'</w:t>
-      </w:r>
-      <w:r>
-        <w:br/>
-      </w:r>
-      <w:r>
-        <w:rPr>
-          <w:rStyle w:val="VerbatimChar"/>
-        </w:rPr>
-        <w:t xml:space="preserve">'/api/rooms/$roomId/music/current' → '/api/chat/rooms/$roomId/music'       // GET</w:t>
-      </w:r>
-      <w:r>
-        <w:br/>
-      </w:r>
-      <w:r>
-        <w:rPr>
-          <w:rStyle w:val="VerbatimChar"/>
-        </w:rPr>
-        <w:t xml:space="preserve">'/api/rooms/$roomId/music/skip'    → '/api/chat/rooms/$roomId/music'       // DELETE (yöntem değişti!)</w:t>
-      </w:r>
-      <w:r>
-        <w:br/>
-      </w:r>
-      <w:r>
-        <w:rPr>
-          <w:rStyle w:val="VerbatimChar"/>
-        </w:rPr>
-        <w:t xml:space="preserve">'/api/rooms/$roomId/music/stop'    → '/api/chat/rooms/$roomId/music/stop'  // POST</w:t>
-      </w:r>
-    </w:p>
-    <w:p>
-      <w:pPr>
-        <w:pStyle w:val="FirstParagraph"/>
-      </w:pPr>
-      <w:r>
-        <w:rPr>
-          <w:bCs/>
-          <w:b/>
-        </w:rPr>
-        <w:t xml:space="preserve">Dikkat:</w:t>
-      </w:r>
-      <w:r>
-        <w:t xml:space="preserve"> </w:t>
-      </w:r>
-      <w:r>
-        <w:rPr>
-          <w:rStyle w:val="VerbatimChar"/>
-        </w:rPr>
-        <w:t xml:space="preserve">music/skip</w:t>
-      </w:r>
-      <w:r>
-        <w:t xml:space="preserve"> </w:t>
-      </w:r>
-      <w:r>
-        <w:t xml:space="preserve">artık</w:t>
-      </w:r>
-      <w:r>
-        <w:t xml:space="preserve"> </w:t>
-      </w:r>
-      <w:r>
-        <w:rPr>
-          <w:rStyle w:val="VerbatimChar"/>
-        </w:rPr>
-        <w:t xml:space="preserve">DELETE</w:t>
-      </w:r>
-      <w:r>
-        <w:t xml:space="preserve"> </w:t>
-      </w:r>
-      <w:r>
-        <w:t xml:space="preserve">yöntemiyle çağrılıyor. Flutter</w:t>
-      </w:r>
-      <w:r>
-        <w:t xml:space="preserve"> </w:t>
-      </w:r>
-      <w:r>
-        <w:rPr>
-          <w:rStyle w:val="VerbatimChar"/>
-        </w:rPr>
-        <w:t xml:space="preserve">http.delete(...)</w:t>
-      </w:r>
-      <w:r>
-        <w:t xml:space="preserve"> </w:t>
-      </w:r>
-      <w:r>
-        <w:t xml:space="preserve">kullanmalı.</w:t>
-      </w:r>
-    </w:p>
-    <w:p>
-      <w:r>
-        <w:pict>
-          <v:rect style="width:0;height:1.5pt" o:hralign="center" o:hrstd="t" o:hr="t"/>
-        </w:pict>
-      </w:r>
-    </w:p>
-    <w:bookmarkEnd w:id="26"/>
-    <w:bookmarkStart w:id="27" w:name="önemli-not-room-vs-rooms"/>
-    <w:p>
-      <w:pPr>
-        <w:pStyle w:val="Heading2"/>
-      </w:pPr>
-      <w:r>
-        <w:t xml:space="preserve">5. Önemli Not — room vs rooms</w:t>
-      </w:r>
-    </w:p>
-    <w:p>
-      <w:pPr>
-        <w:pStyle w:val="FirstParagraph"/>
-      </w:pPr>
-      <w:r>
-        <w:rPr>
-          <w:rStyle w:val="VerbatimChar"/>
-        </w:rPr>
-        <w:t xml:space="preserve">/api/room/{sessionId}/...</w:t>
-      </w:r>
-      <w:r>
-        <w:t xml:space="preserve"> </w:t>
-      </w:r>
-      <w:r>
-        <w:t xml:space="preserve">(canlı fal seansı) ile</w:t>
-      </w:r>
-      <w:r>
-        <w:t xml:space="preserve"> </w:t>
-      </w:r>
-      <w:r>
-        <w:rPr>
-          <w:rStyle w:val="VerbatimChar"/>
-        </w:rPr>
-        <w:t xml:space="preserve">/api/rooms/{roomId}/...</w:t>
-      </w:r>
-      <w:r>
-        <w:t xml:space="preserve"> </w:t>
-      </w:r>
-      <w:r>
-        <w:t xml:space="preserve">(sohbet odası)</w:t>
-      </w:r>
-      <w:r>
-        <w:t xml:space="preserve"> </w:t>
-      </w:r>
-      <w:r>
-        <w:rPr>
-          <w:bCs/>
-          <w:b/>
-        </w:rPr>
-        <w:t xml:space="preserve">farklı kimlik uzaylarıdır</w:t>
-      </w:r>
-      <w:r>
-        <w:t xml:space="preserve"> </w:t>
-      </w:r>
-      <w:r>
-        <w:t xml:space="preserve">ve birleştirilmemiştir. Bunlar kasıtlı olarak ayrı tutulmaktadır:</w:t>
-      </w:r>
-    </w:p>
-    <w:p>
-      <w:pPr>
-        <w:numPr>
-          <w:ilvl w:val="0"/>
-          <w:numId w:val="1005"/>
-        </w:numPr>
-        <w:pStyle w:val="Compact"/>
-      </w:pPr>
-      <w:r>
-        <w:rPr>
-          <w:rStyle w:val="VerbatimChar"/>
-        </w:rPr>
-        <w:t xml:space="preserve">room</w:t>
-      </w:r>
-      <w:r>
-        <w:t xml:space="preserve"> </w:t>
-      </w:r>
-      <w:r>
-        <w:t xml:space="preserve">→ Canlı fal seansı kimliği (</w:t>
-      </w:r>
-      <w:r>
-        <w:rPr>
-          <w:rStyle w:val="VerbatimChar"/>
-        </w:rPr>
-        <w:t xml:space="preserve">LiveSession.id</w:t>
-      </w:r>
-      <w:r>
-        <w:t xml:space="preserve">)</w:t>
-      </w:r>
-    </w:p>
-    <w:p>
-      <w:pPr>
-        <w:numPr>
-          <w:ilvl w:val="0"/>
-          <w:numId w:val="1005"/>
         </w:numPr>
         <w:pStyle w:val="Compact"/>
       </w:pPr>
@@ -1747,12 +1778,6 @@
     <w:abstractNumId w:val="991"/>
   </w:num>
   <w:num w:numId="1003">
-    <w:abstractNumId w:val="991"/>
-  </w:num>
-  <w:num w:numId="1004">
-    <w:abstractNumId w:val="991"/>
-  </w:num>
-  <w:num w:numId="1005">
     <w:abstractNumId w:val="991"/>
   </w:num>
 </w:numbering>

</xml_diff>